<commit_message>
v2.2.1: search the category rail
Add a search box at the top of the category rail (Live TV / Movies / Series)
for big libraries — implemented once in the shared CategoryRail composable.
Focusing the rail lands on the search box so you can type to filter categories
by name; Down drops into the list, and the query clears when the rail loses
focus. Filtering preserves each category's original index, so selection
highlighting and onSelect stay correct. Reuses the two-stage TV SearchBar
(OK opens the keyboard, Back closes it) — no IME trap.
</commit_message>
<xml_diff>
--- a/extras/OwnTV_Complete_Brief_Plan_With_Logo.docx
+++ b/extras/OwnTV_Complete_Brief_Plan_With_Logo.docx
@@ -3189,6 +3189,28 @@
       </w:pPr>
       <w:r>
         <w:t>Smaller fixes — Settings → Playlists rows show channel/movie/series counts instead of the stale “EPG not downloaded” note; the movie details backdrop fills its banner cleanly (issue #5); the zoom/speed player dialogs open focused on the current selection.</w:t>
+      </w:r>
+    </w:p>
+    <w:p>
+      <w:pPr>
+        <w:pStyle w:val="694"/>
+      </w:pPr>
+      <w:r>
+        <w:t>12.14 v2.2.1: category search in the rail</w:t>
+      </w:r>
+    </w:p>
+    <w:p>
+      <w:pPr/>
+      <w:r>
+        <w:t>A small follow-up for large libraries (tens of thousands of channels/movies/series spread across hundreds of categories).</w:t>
+      </w:r>
+    </w:p>
+    <w:p>
+      <w:pPr>
+        <w:pStyle w:val="723"/>
+      </w:pPr>
+      <w:r>
+        <w:t>Category search — the folder rail (Live TV / Movies / Series) gained a search box at its top, implemented inside the shared CategoryRail composable so all three sections get it from one change. It filters categories by name while preserving each category's ORIGINAL index, so selection highlighting and onSelect stay correct on the filtered list. Focusing the rail now lands directly on the search box (scrolled to top) so the user can type immediately; Down drops into the list, and the query resets when the rail loses focus. Reuses the app's two-stage TV SearchBar (OK opens the keyboard, Back closes it) so there's no IME trap.</w:t>
       </w:r>
     </w:p>
     <w:sectPr>

</xml_diff>